<commit_message>
LOI v2: rad om att domänförnyelsen betalas av beställaren direkt
Co-Authored-By: Claude Fable 5 <noreply@anthropic.com>
</commit_message>
<xml_diff>
--- a/Avsiktsforklaring-Cecilia-K-v2.docx
+++ b/Avsiktsforklaring-Cecilia-K-v2.docx
@@ -578,6 +578,19 @@
           <w:szCs w:val="20"/>
         </w:rPr>
         <w:t xml:space="preserve">Större designändringar, tilläggssidor utöver shoppen, marknadsförings- och SEO-arbete samt fotografering/filmning av verk offereras separat. Beställaren ansvarar själv för verksfoton och bildmaterial.</w:t>
+      </w:r>
+    </w:p>
+    <w:p>
+      <w:pPr>
+        <w:spacing w:after="100"/>
+      </w:pPr>
+      <w:r>
+        <w:rPr>
+          <w:rFonts w:ascii="Calibri" w:cs="Calibri" w:eastAsia="Calibri" w:hAnsi="Calibri"/>
+          <w:sz w:val="20"/>
+          <w:szCs w:val="20"/>
+        </w:rPr>
+        <w:t xml:space="preserve">Domänförnyelsen för constcollection.com (ca 110–250 kr/år beroende på registrar) betalas av Beställaren direkt till registraren — domänen är och förblir Beställarens egendom.</w:t>
       </w:r>
     </w:p>
     <w:p>

</xml_diff>

<commit_message>
LOI v2.1: pris 649 kr inkl moms enligt överenskommelse med Cecilia (halvår 3894 kr)
Co-Authored-By: Claude Fable 5 <noreply@anthropic.com>
</commit_message>
<xml_diff>
--- a/Avsiktsforklaring-Cecilia-K-v2.docx
+++ b/Avsiktsforklaring-Cecilia-K-v2.docx
@@ -34,7 +34,7 @@
           <w:sz w:val="20"/>
           <w:szCs w:val="20"/>
         </w:rPr>
-        <w:t xml:space="preserve">Webshop åt Cecilia Kristoffersson · Art by Cecilia K. · Version 2, 30 juli 2026 (ersätter tidigare version)</w:t>
+        <w:t xml:space="preserve">Webshop åt Cecilia Kristoffersson · Art by Cecilia K. · Version 2.1, 1 augusti 2026 — pris enligt muntlig överenskommelse (ersätter tidigare versioner)</w:t>
       </w:r>
     </w:p>
     <w:p>
@@ -201,7 +201,7 @@
           <w:sz w:val="20"/>
           <w:szCs w:val="20"/>
         </w:rPr>
-        <w:t xml:space="preserve">Månadsavgift: 599 kr inklusive moms (motsvarande 479,20 kr exkl. moms).</w:t>
+        <w:t xml:space="preserve">Månadsavgift: 649 kr inklusive moms (motsvarande 519,20 kr exkl. moms).</w:t>
       </w:r>
     </w:p>
     <w:p>
@@ -237,7 +237,7 @@
           <w:sz w:val="20"/>
           <w:szCs w:val="20"/>
         </w:rPr>
-        <w:t xml:space="preserve">Faktura utställs var 6:e månad i förskott: 3 594 kr inkl. moms per faktura.</w:t>
+        <w:t xml:space="preserve">Faktura utställs var 6:e månad i förskott: 3 894 kr inkl. moms per faktura.</w:t>
       </w:r>
     </w:p>
     <w:p>

</xml_diff>